<commit_message>
Incorporate reviewer edits: updated stats, OFAH Foundation branding
- Habitat projects: 150+ -> 300+ (296 completed to date)
- Students: 1,500+ -> 3,000+ reached per year (3,394 at fry releases this year)
- Partner organizations blurb now includes monitoring
- Habitat Restoration card: beneficiaries now fish, wildlife, and people
- Delivered in Partnership credit now reads 'Ontario Federation of
  Anglers and Hunters Foundation'
- Masthead now pairs the OFAH Foundation loon roundel with the
  'OFAH FOUNDATION' wordmark
- Applied across Draft 2 one-pager, single-page print edition,
  self-contained Program Brief, generate_docs.py, and CLAUDE.md
- Regenerated single-page PDF (with embedded fonts) and Program Brief
  PDF/DOCX; tightened single-page print layout so all cards still fit

Co-Authored-By: Claude Fable 5 <noreply@anthropic.com>
Claude-Session: https://claude.ai/code/session_014Kyq2DsKi5s5UwrJ7eHohA
</commit_message>
<xml_diff>
--- a/project/Lake Ontario Atlantic Salmon Communication Plan/Bring Back the Salmon - Program Brief.docx
+++ b/project/Lake Ontario Atlantic Salmon Communication Plan/Bring Back the Salmon - Program Brief.docx
@@ -548,7 +548,7 @@
                 <w:color w:val="0B3A53"/>
                 <w:sz w:val="32"/>
               </w:rPr>
-              <w:t xml:space="preserve">150+  </w:t>
+              <w:t xml:space="preserve">300+  </w:t>
             </w:r>
             <w:r>
               <w:rPr>
@@ -581,7 +581,7 @@
                 <w:color w:val="0B3A53"/>
                 <w:sz w:val="32"/>
               </w:rPr>
-              <w:t xml:space="preserve">1,500+  </w:t>
+              <w:t xml:space="preserve">3,000+  </w:t>
             </w:r>
             <w:r>
               <w:rPr>
@@ -589,7 +589,7 @@
                 <w:color w:val="0F1D24"/>
                 <w:sz w:val="17"/>
               </w:rPr>
-              <w:t>Students reached</w:t>
+              <w:t>Students reached per year</w:t>
             </w:r>
           </w:p>
           <w:p>
@@ -634,7 +634,7 @@
                 <w:color w:val="607078"/>
                 <w:sz w:val="16"/>
               </w:rPr>
-              <w:t>Working together on fish production, habitat restoration, and outreach.</w:t>
+              <w:t>Working together on fish production, habitat restoration, monitoring, and outreach.</w:t>
             </w:r>
           </w:p>
         </w:tc>
@@ -780,7 +780,7 @@
               <w:rPr>
                 <w:sz w:val="17"/>
               </w:rPr>
-              <w:t>Improving streams, shorelines, and watersheds. These efforts benefit fish and wildlife across Lake Ontario.</w:t>
+              <w:t>Improving streams, shorelines, and watersheds. These efforts benefit fish, wildlife, and people across Lake Ontario.</w:t>
             </w:r>
           </w:p>
         </w:tc>
@@ -845,7 +845,7 @@
         <w:rPr>
           <w:sz w:val="18"/>
         </w:rPr>
-        <w:t>Ontario Ministry of Natural Resources · Ontario Federation of Anglers and Hunters</w:t>
+        <w:t>Ontario Ministry of Natural Resources · Ontario Federation of Anglers and Hunters Foundation</w:t>
       </w:r>
     </w:p>
     <w:p>

</xml_diff>